<commit_message>
Add designed Senior Backend resume and build script
</commit_message>
<xml_diff>
--- a/resumes/senior-backend/resume.docx
+++ b/resumes/senior-backend/resume.docx
@@ -4,295 +4,843 @@
   <w:body>
     <w:p>
       <w:pPr>
+        <w:spacing w:after="20"/>
         <w:jc w:val="center"/>
       </w:pPr>
       <w:r>
         <w:rPr>
           <w:b/>
-          <w:sz w:val="32"/>
+          <w:color w:val="1B375C"/>
+          <w:sz w:val="44"/>
         </w:rPr>
         <w:t>Sadman Sobhan</w:t>
       </w:r>
     </w:p>
     <w:p>
+      <w:pPr>
+        <w:spacing w:after="40"/>
+        <w:jc w:val="center"/>
+      </w:pPr>
       <w:r>
-        <w:t>Senior Backend Engineer | Java, Spring Boot, PostgreSQL, Microservices</w:t>
-      </w:r>
-    </w:p>
-    <w:p>
-      <w:r>
-        <w:t>Dhaka, Bangladesh | +8801912070224 | imran110219@gmail.com</w:t>
-      </w:r>
-    </w:p>
-    <w:p>
-      <w:r>
-        <w:t>LinkedIn: www.linkedin.com/in/sadmansobhan | Website: www.sadmansobhan.com</w:t>
+        <w:rPr>
+          <w:b/>
+          <w:color w:val="1B375C"/>
+          <w:sz w:val="22"/>
+        </w:rPr>
+        <w:t>Senior Backend Engineer  |  Java  |  Spring Boot  |  PostgreSQL  |  Distributed Systems</w:t>
       </w:r>
     </w:p>
     <w:p>
       <w:pPr>
-        <w:spacing w:before="140" w:after="40"/>
+        <w:spacing w:after="0"/>
+        <w:jc w:val="center"/>
       </w:pPr>
       <w:r>
         <w:rPr>
-          <w:b/>
-          <w:sz w:val="22"/>
+          <w:b w:val="0"/>
+          <w:color w:val="525860"/>
+          <w:sz w:val="18"/>
         </w:rPr>
+        <w:t xml:space="preserve">Dhaka, Bangladesh  |  +8801912070224  |  </w:t>
+      </w:r>
+      <w:hyperlink r:id="rId9">
+        <w:r>
+          <w:rPr>
+            <w:color w:val="1B375C"/>
+            <w:u w:val="single"/>
+          </w:rPr>
+          <w:t>imran110219@gmail.com</w:t>
+        </w:r>
+      </w:hyperlink>
+    </w:p>
+    <w:p>
+      <w:pPr>
+        <w:spacing w:after="60"/>
+        <w:jc w:val="center"/>
+        <w:pBdr>
+          <w:bottom w:val="single" w:sz="8" w:space="5" w:color="1B375C"/>
+        </w:pBdr>
+      </w:pPr>
+      <w:hyperlink r:id="rId10">
+        <w:r>
+          <w:rPr>
+            <w:color w:val="1B375C"/>
+            <w:u w:val="single"/>
+          </w:rPr>
+          <w:t>linkedin.com/in/sadmansobhan</w:t>
+        </w:r>
+      </w:hyperlink>
+      <w:r>
+        <w:rPr>
+          <w:b w:val="0"/>
+          <w:color w:val="525860"/>
+          <w:sz w:val="18"/>
+        </w:rPr>
+        <w:t xml:space="preserve">  |  </w:t>
+      </w:r>
+      <w:hyperlink r:id="rId11">
+        <w:r>
+          <w:rPr>
+            <w:color w:val="1B375C"/>
+            <w:u w:val="single"/>
+          </w:rPr>
+          <w:t>sadmansobhan.com</w:t>
+        </w:r>
+      </w:hyperlink>
+    </w:p>
+    <w:p>
+      <w:pPr>
+        <w:pStyle w:val="ResumeSection"/>
+        <w:spacing w:before="140" w:after="60"/>
+        <w:pBdr>
+          <w:bottom w:val="single" w:sz="8" w:space="5" w:color="1B375C"/>
+        </w:pBdr>
+        <w:keepNext/>
+      </w:pPr>
+      <w:r>
         <w:t>PROFESSIONAL SUMMARY</w:t>
       </w:r>
     </w:p>
     <w:p>
+      <w:pPr>
+        <w:spacing w:after="20" w:line="247" w:lineRule="auto"/>
+      </w:pPr>
       <w:r>
-        <w:t>Senior Software Engineer with 9+ years of experience building secure, scalable backend systems for government, education, healthcare, and enterprise domains. Hands-on with Java, Spring Boot, PostgreSQL, REST APIs, Redis, microservices, and Kubernetes-based deployment; experienced in backend leadership, data modeling, performance improvement, and production delivery.</w:t>
+        <w:rPr>
+          <w:b w:val="0"/>
+        </w:rPr>
+        <w:t>Senior Software Engineer with 9+ years of experience delivering secure, scalable backend systems across government, education, healthcare, and enterprise domains. Specializes in Java, Spring Boot, PostgreSQL, distributed systems, API design, and performance optimization, with hands-on technical leadership from planning through production delivery.</w:t>
       </w:r>
     </w:p>
     <w:p>
       <w:pPr>
-        <w:spacing w:before="140" w:after="40"/>
+        <w:pStyle w:val="ResumeSection"/>
+        <w:spacing w:before="140" w:after="60"/>
+        <w:pBdr>
+          <w:bottom w:val="single" w:sz="8" w:space="5" w:color="1B375C"/>
+        </w:pBdr>
+        <w:keepNext/>
+      </w:pPr>
+      <w:r>
+        <w:t>CAREER HIGHLIGHTS</w:t>
+      </w:r>
+    </w:p>
+    <w:p>
+      <w:pPr>
+        <w:spacing w:after="36" w:line="245" w:lineRule="auto"/>
+        <w:ind w:left="245" w:hanging="187"/>
+        <w:keepLines/>
       </w:pPr>
       <w:r>
         <w:rPr>
-          <w:b/>
-          <w:sz w:val="22"/>
+          <w:b w:val="0"/>
+          <w:color w:val="1B375C"/>
         </w:rPr>
+        <w:t xml:space="preserve">•  </w:t>
+      </w:r>
+      <w:r>
+        <w:rPr>
+          <w:b w:val="0"/>
+        </w:rPr>
+        <w:t>Backend team lead contributing to grooming, planning, implementation guidance, and code reviews within a 30-person development team</w:t>
+      </w:r>
+    </w:p>
+    <w:p>
+      <w:pPr>
+        <w:spacing w:after="36" w:line="245" w:lineRule="auto"/>
+        <w:ind w:left="245" w:hanging="187"/>
+        <w:keepLines/>
+      </w:pPr>
+      <w:r>
+        <w:rPr>
+          <w:b w:val="0"/>
+          <w:color w:val="1B375C"/>
+        </w:rPr>
+        <w:t xml:space="preserve">•  </w:t>
+      </w:r>
+      <w:r>
+        <w:rPr>
+          <w:b w:val="0"/>
+        </w:rPr>
+        <w:t>Designed and delivered Java and Spring Boot services across a microservices architecture of nearly 20 running services</w:t>
+      </w:r>
+    </w:p>
+    <w:p>
+      <w:pPr>
+        <w:spacing w:after="36" w:line="245" w:lineRule="auto"/>
+        <w:ind w:left="245" w:hanging="187"/>
+        <w:keepLines/>
+      </w:pPr>
+      <w:r>
+        <w:rPr>
+          <w:b w:val="0"/>
+          <w:color w:val="1B375C"/>
+        </w:rPr>
+        <w:t xml:space="preserve">•  </w:t>
+      </w:r>
+      <w:r>
+        <w:rPr>
+          <w:b w:val="0"/>
+        </w:rPr>
+        <w:t>Helped deliver an internal election-management platform supporting 50,000 users alongside a public-facing application</w:t>
+      </w:r>
+    </w:p>
+    <w:p>
+      <w:pPr>
+        <w:spacing w:after="36" w:line="245" w:lineRule="auto"/>
+        <w:ind w:left="245" w:hanging="187"/>
+        <w:keepLines/>
+      </w:pPr>
+      <w:r>
+        <w:rPr>
+          <w:b w:val="0"/>
+          <w:color w:val="1B375C"/>
+        </w:rPr>
+        <w:t xml:space="preserve">•  </w:t>
+      </w:r>
+      <w:r>
+        <w:rPr>
+          <w:b w:val="0"/>
+        </w:rPr>
+        <w:t>Reduced exam-management system response time by 30% through Redis caching and backend performance improvements</w:t>
+      </w:r>
+    </w:p>
+    <w:p>
+      <w:pPr>
+        <w:spacing w:after="36" w:line="245" w:lineRule="auto"/>
+        <w:ind w:left="245" w:hanging="187"/>
+        <w:keepLines/>
+      </w:pPr>
+      <w:r>
+        <w:rPr>
+          <w:b w:val="0"/>
+          <w:color w:val="1B375C"/>
+        </w:rPr>
+        <w:t xml:space="preserve">•  </w:t>
+      </w:r>
+      <w:r>
+        <w:rPr>
+          <w:b w:val="0"/>
+        </w:rPr>
+        <w:t>Supported production workflows used by 2,500+ administrators, 1,000 invigilators, and 1,000 examinees, including payments for nearly 30,000 students</w:t>
+      </w:r>
+    </w:p>
+    <w:p>
+      <w:pPr>
+        <w:spacing w:after="36" w:line="245" w:lineRule="auto"/>
+        <w:ind w:left="245" w:hanging="187"/>
+        <w:keepLines/>
+      </w:pPr>
+      <w:r>
+        <w:rPr>
+          <w:b w:val="0"/>
+          <w:color w:val="1B375C"/>
+        </w:rPr>
+        <w:t xml:space="preserve">•  </w:t>
+      </w:r>
+      <w:r>
+        <w:rPr>
+          <w:b w:val="0"/>
+        </w:rPr>
+        <w:t>Contributed to the National Electronic Government Procurement System, supporting enterprise workflows, data integrity, and privacy</w:t>
+      </w:r>
+    </w:p>
+    <w:p>
+      <w:pPr>
+        <w:pStyle w:val="ResumeSection"/>
+        <w:spacing w:before="140" w:after="60"/>
+        <w:pBdr>
+          <w:bottom w:val="single" w:sz="8" w:space="5" w:color="1B375C"/>
+        </w:pBdr>
+        <w:keepNext/>
+      </w:pPr>
+      <w:r>
         <w:t>TECHNICAL SKILLS</w:t>
       </w:r>
     </w:p>
     <w:p>
       <w:pPr>
-        <w:pStyle w:val="ListBullet"/>
-        <w:spacing w:after="20"/>
+        <w:spacing w:after="20" w:line="240" w:lineRule="auto"/>
+        <w:keepLines/>
       </w:pPr>
       <w:r>
-        <w:t>Backend: Java, Spring Boot, Hibernate, REST APIs, microservices, backend architecture</w:t>
+        <w:rPr>
+          <w:b/>
+          <w:color w:val="1B375C"/>
+          <w:sz w:val="19"/>
+        </w:rPr>
+        <w:t xml:space="preserve">Languages: </w:t>
+      </w:r>
+      <w:r>
+        <w:rPr>
+          <w:b w:val="0"/>
+          <w:sz w:val="19"/>
+        </w:rPr>
+        <w:t>Java, SQL, C#</w:t>
       </w:r>
     </w:p>
     <w:p>
       <w:pPr>
-        <w:pStyle w:val="ListBullet"/>
-        <w:spacing w:after="20"/>
+        <w:spacing w:after="20" w:line="240" w:lineRule="auto"/>
+        <w:keepLines/>
       </w:pPr>
       <w:r>
-        <w:t>Data and performance: PostgreSQL, SQL Server, database modeling, Redis caching, query optimization</w:t>
+        <w:rPr>
+          <w:b/>
+          <w:color w:val="1B375C"/>
+          <w:sz w:val="19"/>
+        </w:rPr>
+        <w:t xml:space="preserve">Backend: </w:t>
+      </w:r>
+      <w:r>
+        <w:rPr>
+          <w:b w:val="0"/>
+          <w:sz w:val="19"/>
+        </w:rPr>
+        <w:t>Spring Boot, Hibernate, REST APIs, Microservices, Backend Architecture</w:t>
       </w:r>
     </w:p>
     <w:p>
       <w:pPr>
-        <w:pStyle w:val="ListBullet"/>
-        <w:spacing w:after="20"/>
+        <w:spacing w:after="20" w:line="240" w:lineRule="auto"/>
+        <w:keepLines/>
       </w:pPr>
       <w:r>
-        <w:t>Platform and security: Kubernetes, Keycloak, authentication, authorization, data integrity</w:t>
+        <w:rPr>
+          <w:b/>
+          <w:color w:val="1B375C"/>
+          <w:sz w:val="19"/>
+        </w:rPr>
+        <w:t xml:space="preserve">Data &amp; Performance: </w:t>
+      </w:r>
+      <w:r>
+        <w:rPr>
+          <w:b w:val="0"/>
+          <w:sz w:val="19"/>
+        </w:rPr>
+        <w:t>PostgreSQL, SQL Server, Redis, Database Modeling, Query Optimization</w:t>
       </w:r>
     </w:p>
     <w:p>
       <w:pPr>
-        <w:pStyle w:val="ListBullet"/>
-        <w:spacing w:after="20"/>
+        <w:spacing w:after="20" w:line="240" w:lineRule="auto"/>
+        <w:keepLines/>
       </w:pPr>
       <w:r>
-        <w:t>Delivery: Requirements analysis, Agile development, deployment, code review, mentoring, stakeholder collaboration</w:t>
+        <w:rPr>
+          <w:b/>
+          <w:color w:val="1B375C"/>
+          <w:sz w:val="19"/>
+        </w:rPr>
+        <w:t xml:space="preserve">Security &amp; Platform: </w:t>
+      </w:r>
+      <w:r>
+        <w:rPr>
+          <w:b w:val="0"/>
+          <w:sz w:val="19"/>
+        </w:rPr>
+        <w:t>Keycloak, Authentication, Authorization, Kubernetes, Data Integrity</w:t>
       </w:r>
     </w:p>
     <w:p>
       <w:pPr>
-        <w:spacing w:before="140" w:after="40"/>
+        <w:spacing w:after="20" w:line="240" w:lineRule="auto"/>
+        <w:keepLines/>
       </w:pPr>
       <w:r>
         <w:rPr>
           <w:b/>
-          <w:sz w:val="22"/>
+          <w:color w:val="1B375C"/>
+          <w:sz w:val="19"/>
         </w:rPr>
+        <w:t xml:space="preserve">Delivery: </w:t>
+      </w:r>
+      <w:r>
+        <w:rPr>
+          <w:b w:val="0"/>
+          <w:sz w:val="19"/>
+        </w:rPr>
+        <w:t>Agile Development, Requirements Analysis, Deployment, Code Review, Mentoring</w:t>
+      </w:r>
+    </w:p>
+    <w:p>
+      <w:r>
+        <w:br w:type="page"/>
+      </w:r>
+    </w:p>
+    <w:p>
+      <w:pPr>
+        <w:pStyle w:val="ResumeSection"/>
+        <w:spacing w:before="140" w:after="60"/>
+        <w:pBdr>
+          <w:bottom w:val="single" w:sz="8" w:space="5" w:color="1B375C"/>
+        </w:pBdr>
+        <w:keepNext/>
+      </w:pPr>
+      <w:r>
         <w:t>PROFESSIONAL EXPERIENCE</w:t>
       </w:r>
     </w:p>
     <w:p>
       <w:pPr>
-        <w:spacing w:before="80" w:after="20"/>
+        <w:pStyle w:val="ResumeRole"/>
+        <w:spacing w:before="90" w:after="8"/>
+        <w:keepNext/>
       </w:pPr>
       <w:r>
         <w:rPr>
           <w:b/>
-          <w:sz w:val="20"/>
         </w:rPr>
-        <w:t>Penta Global Ltd. - Senior Software Engineer</w:t>
+        <w:t>Penta Global Ltd.</w:t>
       </w:r>
-    </w:p>
-    <w:p>
       <w:r>
-        <w:t>Dhaka, Bangladesh | August 2023 - Present</w:t>
+        <w:rPr>
+          <w:b w:val="0"/>
+          <w:color w:val="525860"/>
+        </w:rPr>
+        <w:t xml:space="preserve">  |  Dhaka, Bangladesh</w:t>
       </w:r>
     </w:p>
     <w:p>
       <w:pPr>
-        <w:pStyle w:val="ListBullet"/>
-        <w:spacing w:after="20"/>
+        <w:spacing w:after="30"/>
+        <w:keepNext/>
       </w:pPr>
       <w:r>
-        <w:t>Serve as backend team lead for an Election Management System, guiding grooming, planning, implementation, and code reviews within a 30-person development team.</w:t>
+        <w:rPr>
+          <w:b/>
+          <w:sz w:val="19"/>
+        </w:rPr>
+        <w:t>Senior Software Engineer</w:t>
+      </w:r>
+      <w:r>
+        <w:rPr>
+          <w:b w:val="0"/>
+          <w:color w:val="525860"/>
+          <w:sz w:val="19"/>
+        </w:rPr>
+        <w:t xml:space="preserve">  |  August 2023 – Present</w:t>
       </w:r>
     </w:p>
     <w:p>
       <w:pPr>
-        <w:pStyle w:val="ListBullet"/>
-        <w:spacing w:after="20"/>
+        <w:spacing w:after="36" w:line="245" w:lineRule="auto"/>
+        <w:ind w:left="245" w:hanging="187"/>
+        <w:keepLines/>
       </w:pPr>
       <w:r>
-        <w:t>Design and implement secure, scalable Java, Spring Boot, Hibernate, and REST API services across a microservices architecture of nearly 20 running services.</w:t>
+        <w:rPr>
+          <w:b w:val="0"/>
+          <w:color w:val="1B375C"/>
+        </w:rPr>
+        <w:t xml:space="preserve">•  </w:t>
+      </w:r>
+      <w:r>
+        <w:rPr>
+          <w:b w:val="0"/>
+        </w:rPr>
+        <w:t>Serve as backend team lead for an Election Management System, guiding grooming, planning, implementation, and code reviews within a 30-person development team</w:t>
       </w:r>
     </w:p>
     <w:p>
       <w:pPr>
-        <w:pStyle w:val="ListBullet"/>
-        <w:spacing w:after="20"/>
+        <w:spacing w:after="36" w:line="245" w:lineRule="auto"/>
+        <w:ind w:left="245" w:hanging="187"/>
+        <w:keepLines/>
       </w:pPr>
       <w:r>
-        <w:t>Help deliver an internal system supporting 50,000 users, alongside a public-facing application that does not require authentication.</w:t>
+        <w:rPr>
+          <w:b w:val="0"/>
+          <w:color w:val="1B375C"/>
+        </w:rPr>
+        <w:t xml:space="preserve">•  </w:t>
+      </w:r>
+      <w:r>
+        <w:rPr>
+          <w:b w:val="0"/>
+        </w:rPr>
+        <w:t>Design and implement secure, scalable Java, Spring Boot, Hibernate, and REST API services across a microservices architecture of nearly 20 running services</w:t>
       </w:r>
     </w:p>
     <w:p>
       <w:pPr>
-        <w:pStyle w:val="ListBullet"/>
-        <w:spacing w:after="20"/>
+        <w:spacing w:after="36" w:line="245" w:lineRule="auto"/>
+        <w:ind w:left="245" w:hanging="187"/>
+        <w:keepLines/>
       </w:pPr>
       <w:r>
-        <w:t>Support deployments to the organization's self-managed data center using Kubernetes and digitized election-result workflows previously dependent on paperwork and physical result delivery.</w:t>
+        <w:rPr>
+          <w:b w:val="0"/>
+          <w:color w:val="1B375C"/>
+        </w:rPr>
+        <w:t xml:space="preserve">•  </w:t>
+      </w:r>
+      <w:r>
+        <w:rPr>
+          <w:b w:val="0"/>
+        </w:rPr>
+        <w:t>Help deliver an internal system supporting 50,000 users alongside a public-facing application that does not require authentication</w:t>
       </w:r>
     </w:p>
     <w:p>
       <w:pPr>
-        <w:spacing w:before="80" w:after="20"/>
+        <w:spacing w:after="36" w:line="245" w:lineRule="auto"/>
+        <w:ind w:left="245" w:hanging="187"/>
+        <w:keepLines/>
+      </w:pPr>
+      <w:r>
+        <w:rPr>
+          <w:b w:val="0"/>
+          <w:color w:val="1B375C"/>
+        </w:rPr>
+        <w:t xml:space="preserve">•  </w:t>
+      </w:r>
+      <w:r>
+        <w:rPr>
+          <w:b w:val="0"/>
+        </w:rPr>
+        <w:t>Support Kubernetes deployments to the organization’s self-managed data center and digitized election-result workflows formerly dependent on paperwork and physical result delivery</w:t>
+      </w:r>
+    </w:p>
+    <w:p>
+      <w:pPr>
+        <w:pStyle w:val="ResumeRole"/>
+        <w:spacing w:before="90" w:after="8"/>
+        <w:keepNext/>
       </w:pPr>
       <w:r>
         <w:rPr>
           <w:b/>
-          <w:sz w:val="20"/>
         </w:rPr>
-        <w:t>Dynamic Solution Innovators Ltd. - Software Engineer</w:t>
+        <w:t>Dynamic Solution Innovators Ltd.</w:t>
       </w:r>
-    </w:p>
-    <w:p>
       <w:r>
-        <w:t>Dhaka, Bangladesh | January 2022 - July 2023</w:t>
+        <w:rPr>
+          <w:b w:val="0"/>
+          <w:color w:val="525860"/>
+        </w:rPr>
+        <w:t xml:space="preserve">  |  Dhaka, Bangladesh</w:t>
       </w:r>
     </w:p>
     <w:p>
       <w:pPr>
-        <w:pStyle w:val="ListBullet"/>
-        <w:spacing w:after="20"/>
+        <w:spacing w:after="30"/>
+        <w:keepNext/>
       </w:pPr>
       <w:r>
-        <w:t>Led development of an exam management system using Java, Spring Boot, PostgreSQL, Flutter, and Crystal Reports; analyzed requirements and designed its database schema.</w:t>
+        <w:rPr>
+          <w:b/>
+          <w:sz w:val="19"/>
+        </w:rPr>
+        <w:t>Software Engineer</w:t>
+      </w:r>
+      <w:r>
+        <w:rPr>
+          <w:b w:val="0"/>
+          <w:color w:val="525860"/>
+          <w:sz w:val="19"/>
+        </w:rPr>
+        <w:t xml:space="preserve">  |  January 2022 – July 2023</w:t>
       </w:r>
     </w:p>
     <w:p>
       <w:pPr>
-        <w:pStyle w:val="ListBullet"/>
-        <w:spacing w:after="20"/>
+        <w:spacing w:after="36" w:line="245" w:lineRule="auto"/>
+        <w:ind w:left="245" w:hanging="187"/>
+        <w:keepLines/>
       </w:pPr>
       <w:r>
-        <w:t>Reduced system response time by 30% through Redis caching and backend performance improvements.</w:t>
+        <w:rPr>
+          <w:b w:val="0"/>
+          <w:color w:val="1B375C"/>
+        </w:rPr>
+        <w:t xml:space="preserve">•  </w:t>
+      </w:r>
+      <w:r>
+        <w:rPr>
+          <w:b w:val="0"/>
+        </w:rPr>
+        <w:t>Led development of an exam management system using Java, Spring Boot, PostgreSQL, Flutter, and Crystal Reports; analyzed requirements and designed its database schema</w:t>
       </w:r>
     </w:p>
     <w:p>
       <w:pPr>
-        <w:pStyle w:val="ListBullet"/>
-        <w:spacing w:after="20"/>
+        <w:spacing w:after="36" w:line="245" w:lineRule="auto"/>
+        <w:ind w:left="245" w:hanging="187"/>
+        <w:keepLines/>
       </w:pPr>
       <w:r>
-        <w:t>Built a real-time administrator dashboard that contributed to a 40% increase in system usage and user satisfaction.</w:t>
+        <w:rPr>
+          <w:b w:val="0"/>
+          <w:color w:val="1B375C"/>
+        </w:rPr>
+        <w:t xml:space="preserve">•  </w:t>
+      </w:r>
+      <w:r>
+        <w:rPr>
+          <w:b w:val="0"/>
+        </w:rPr>
+        <w:t>Reduced system response time by 30% through Redis caching and backend performance improvements</w:t>
       </w:r>
     </w:p>
     <w:p>
       <w:pPr>
-        <w:pStyle w:val="ListBullet"/>
-        <w:spacing w:after="20"/>
+        <w:spacing w:after="36" w:line="245" w:lineRule="auto"/>
+        <w:ind w:left="245" w:hanging="187"/>
+        <w:keepLines/>
       </w:pPr>
       <w:r>
-        <w:t>Deployed a production system used by 2,500+ administrators, 1,000 exam invigilators, and 1,000 examinees; supported registration and payment management for nearly 30,000 students.</w:t>
+        <w:rPr>
+          <w:b w:val="0"/>
+          <w:color w:val="1B375C"/>
+        </w:rPr>
+        <w:t xml:space="preserve">•  </w:t>
+      </w:r>
+      <w:r>
+        <w:rPr>
+          <w:b w:val="0"/>
+        </w:rPr>
+        <w:t>Built a real-time administrator dashboard that contributed to a 40% increase in system usage and user satisfaction</w:t>
       </w:r>
     </w:p>
     <w:p>
       <w:pPr>
-        <w:spacing w:before="80" w:after="20"/>
+        <w:spacing w:after="36" w:line="245" w:lineRule="auto"/>
+        <w:ind w:left="245" w:hanging="187"/>
+        <w:keepLines/>
+      </w:pPr>
+      <w:r>
+        <w:rPr>
+          <w:b w:val="0"/>
+          <w:color w:val="1B375C"/>
+        </w:rPr>
+        <w:t xml:space="preserve">•  </w:t>
+      </w:r>
+      <w:r>
+        <w:rPr>
+          <w:b w:val="0"/>
+        </w:rPr>
+        <w:t>Deployed a production system used by 2,500+ administrators, 1,000 invigilators, and 1,000 examinees; supported registration and payment management for nearly 30,000 students</w:t>
+      </w:r>
+    </w:p>
+    <w:p>
+      <w:pPr>
+        <w:pStyle w:val="ResumeRole"/>
+        <w:spacing w:before="90" w:after="8"/>
+        <w:keepNext/>
       </w:pPr>
       <w:r>
         <w:rPr>
           <w:b/>
-          <w:sz w:val="20"/>
         </w:rPr>
-        <w:t>Dohatec New Media - Java Software Engineer</w:t>
+        <w:t>Dohatec New Media</w:t>
       </w:r>
-    </w:p>
-    <w:p>
       <w:r>
-        <w:t>Dhaka, Bangladesh | October 2016 - December 2021</w:t>
+        <w:rPr>
+          <w:b w:val="0"/>
+          <w:color w:val="525860"/>
+        </w:rPr>
+        <w:t xml:space="preserve">  |  Dhaka, Bangladesh</w:t>
       </w:r>
     </w:p>
     <w:p>
       <w:pPr>
-        <w:pStyle w:val="ListBullet"/>
-        <w:spacing w:after="20"/>
+        <w:spacing w:after="30"/>
+        <w:keepNext/>
       </w:pPr>
       <w:r>
-        <w:t>Implemented features and resolved defects for the National Electronic Government Procurement System while preserving data privacy and integrity.</w:t>
+        <w:rPr>
+          <w:b/>
+          <w:sz w:val="19"/>
+        </w:rPr>
+        <w:t>Java Software Engineer</w:t>
+      </w:r>
+      <w:r>
+        <w:rPr>
+          <w:b w:val="0"/>
+          <w:color w:val="525860"/>
+          <w:sz w:val="19"/>
+        </w:rPr>
+        <w:t xml:space="preserve">  |  October 2016 – December 2021</w:t>
       </w:r>
     </w:p>
     <w:p>
       <w:pPr>
-        <w:pStyle w:val="ListBullet"/>
-        <w:spacing w:after="20"/>
+        <w:spacing w:after="36" w:line="245" w:lineRule="auto"/>
+        <w:ind w:left="245" w:hanging="187"/>
+        <w:keepLines/>
       </w:pPr>
       <w:r>
-        <w:t>Contributed to large-file upload capabilities, relational data modeling, and enterprise workflow features; helped drive an 80% increase in user engagement over six months.</w:t>
+        <w:rPr>
+          <w:b w:val="0"/>
+          <w:color w:val="1B375C"/>
+        </w:rPr>
+        <w:t xml:space="preserve">•  </w:t>
+      </w:r>
+      <w:r>
+        <w:rPr>
+          <w:b w:val="0"/>
+        </w:rPr>
+        <w:t>Implemented features and resolved defects for the National Electronic Government Procurement System while preserving data privacy and integrity</w:t>
       </w:r>
     </w:p>
     <w:p>
       <w:pPr>
-        <w:spacing w:before="80" w:after="20"/>
+        <w:spacing w:after="36" w:line="245" w:lineRule="auto"/>
+        <w:ind w:left="245" w:hanging="187"/>
+        <w:keepLines/>
+      </w:pPr>
+      <w:r>
+        <w:rPr>
+          <w:b w:val="0"/>
+          <w:color w:val="1B375C"/>
+        </w:rPr>
+        <w:t xml:space="preserve">•  </w:t>
+      </w:r>
+      <w:r>
+        <w:rPr>
+          <w:b w:val="0"/>
+        </w:rPr>
+        <w:t>Contributed to large-file upload capabilities, relational data modeling, and enterprise workflow features; helped drive an 80% increase in user engagement over six months</w:t>
+      </w:r>
+    </w:p>
+    <w:p>
+      <w:pPr>
+        <w:pStyle w:val="ResumeRole"/>
+        <w:spacing w:before="90" w:after="8"/>
+        <w:keepNext/>
       </w:pPr>
       <w:r>
         <w:rPr>
           <w:b/>
-          <w:sz w:val="20"/>
         </w:rPr>
-        <w:t>Jaliks Soft IT Limited - .NET Developer</w:t>
+        <w:t>Jaliks Soft IT Limited</w:t>
       </w:r>
-    </w:p>
-    <w:p>
       <w:r>
-        <w:t>Khulna, Bangladesh | February 2016 - June 2016</w:t>
+        <w:rPr>
+          <w:b w:val="0"/>
+          <w:color w:val="525860"/>
+        </w:rPr>
+        <w:t xml:space="preserve">  |  Khulna, Bangladesh</w:t>
       </w:r>
     </w:p>
     <w:p>
       <w:pPr>
-        <w:pStyle w:val="ListBullet"/>
-        <w:spacing w:after="20"/>
+        <w:spacing w:after="30"/>
+        <w:keepNext/>
       </w:pPr>
       <w:r>
-        <w:t>Implemented features and resolved defects for a large-scale education application using ASP.NET, C#, and SQL Server.</w:t>
+        <w:rPr>
+          <w:b/>
+          <w:sz w:val="19"/>
+        </w:rPr>
+        <w:t>.NET Developer</w:t>
+      </w:r>
+      <w:r>
+        <w:rPr>
+          <w:b w:val="0"/>
+          <w:color w:val="525860"/>
+          <w:sz w:val="19"/>
+        </w:rPr>
+        <w:t xml:space="preserve">  |  February 2016 – June 2016</w:t>
       </w:r>
     </w:p>
     <w:p>
       <w:pPr>
-        <w:spacing w:before="140" w:after="40"/>
+        <w:spacing w:after="36" w:line="245" w:lineRule="auto"/>
+        <w:ind w:left="245" w:hanging="187"/>
+        <w:keepLines/>
+      </w:pPr>
+      <w:r>
+        <w:rPr>
+          <w:b w:val="0"/>
+          <w:color w:val="1B375C"/>
+        </w:rPr>
+        <w:t xml:space="preserve">•  </w:t>
+      </w:r>
+      <w:r>
+        <w:rPr>
+          <w:b w:val="0"/>
+        </w:rPr>
+        <w:t>Implemented features and resolved defects for a large-scale education application using ASP.NET, C#, and SQL Server</w:t>
+      </w:r>
+    </w:p>
+    <w:p>
+      <w:pPr>
+        <w:pStyle w:val="ResumeSection"/>
+        <w:spacing w:before="140" w:after="60"/>
+        <w:pBdr>
+          <w:bottom w:val="single" w:sz="8" w:space="5" w:color="1B375C"/>
+        </w:pBdr>
+        <w:keepNext/>
+      </w:pPr>
+      <w:r>
+        <w:t>EDUCATION</w:t>
+      </w:r>
+    </w:p>
+    <w:p>
+      <w:pPr>
+        <w:spacing w:after="0"/>
+        <w:keepLines/>
       </w:pPr>
       <w:r>
         <w:rPr>
           <w:b/>
-          <w:sz w:val="22"/>
+          <w:sz w:val="19"/>
         </w:rPr>
-        <w:t>EDUCATION</w:t>
+        <w:t>Bachelor of Science in Computer Science and Engineering</w:t>
+      </w:r>
+      <w:r>
+        <w:rPr>
+          <w:b w:val="0"/>
+          <w:color w:val="525860"/>
+          <w:sz w:val="19"/>
+        </w:rPr>
+        <w:t xml:space="preserve">  |  Khulna University  |  2011 – 2016</w:t>
       </w:r>
     </w:p>
     <w:p>
+      <w:pPr>
+        <w:pStyle w:val="ResumeSection"/>
+        <w:spacing w:before="140" w:after="60"/>
+        <w:pBdr>
+          <w:bottom w:val="single" w:sz="8" w:space="5" w:color="1B375C"/>
+        </w:pBdr>
+        <w:keepNext/>
+      </w:pPr>
       <w:r>
-        <w:t>Bachelor of Science in Computer Science and Engineering, Khulna University | 2011 - 2016</w:t>
+        <w:t>PUBLICATIONS</w:t>
+      </w:r>
+    </w:p>
+    <w:p>
+      <w:pPr>
+        <w:spacing w:after="20" w:line="240" w:lineRule="auto"/>
+        <w:keepLines/>
+      </w:pPr>
+      <w:r>
+        <w:rPr>
+          <w:b w:val="0"/>
+          <w:sz w:val="18"/>
+        </w:rPr>
+        <w:t>Temporal Relation Extraction using Apriori Algorithm</w:t>
+      </w:r>
+    </w:p>
+    <w:p>
+      <w:pPr>
+        <w:spacing w:after="20" w:line="240" w:lineRule="auto"/>
+        <w:keepLines/>
+      </w:pPr>
+      <w:r>
+        <w:rPr>
+          <w:b w:val="0"/>
+          <w:sz w:val="18"/>
+        </w:rPr>
+        <w:t>An Effective Attendance Monitoring System with Fraud Prevention Technique for Educational Institutions</w:t>
       </w:r>
     </w:p>
     <w:sectPr>
-      <w:pgSz w:w="12240" w:h="15840"/>
-      <w:pgMar w:top="792" w:right="936" w:bottom="792" w:left="936" w:header="720" w:footer="720" w:gutter="0"/>
+      <w:pgSz w:w="11905" w:h="16838"/>
+      <w:pgMar w:top="792" w:right="893" w:bottom="792" w:left="893" w:header="360" w:footer="360" w:gutter="0"/>
       <w:cols w:space="720"/>
       <w:docGrid w:linePitch="360"/>
     </w:sectPr>
@@ -664,11 +1212,12 @@
     <w:qFormat/>
     <w:rsid w:val="00FC693F"/>
     <w:pPr>
-      <w:spacing w:after="60"/>
+      <w:spacing w:after="0" w:line="247" w:lineRule="auto"/>
     </w:pPr>
     <w:rPr>
-      <w:rFonts w:ascii="Calibri" w:hAnsi="Calibri"/>
-      <w:sz w:val="19"/>
+      <w:rFonts w:ascii="Arial" w:hAnsi="Arial" w:eastAsia="Arial"/>
+      <w:color w:val="23272D"/>
+      <w:sz w:val="20"/>
     </w:rPr>
   </w:style>
   <w:style w:type="paragraph" w:styleId="Header">
@@ -12352,6 +12901,24 @@
         <w:shd w:val="clear" w:color="auto" w:fill="FBCAA2" w:themeFill="accent6" w:themeFillTint="7F"/>
       </w:tcPr>
     </w:tblStylePr>
+  </w:style>
+  <w:style w:type="paragraph" w:customStyle="1" w:styleId="ResumeSection">
+    <w:name w:val="Resume Section"/>
+    <w:rPr>
+      <w:rFonts w:ascii="Arial" w:hAnsi="Arial" w:eastAsia="Arial"/>
+      <w:b/>
+      <w:color w:val="1B375C"/>
+      <w:sz w:val="22"/>
+    </w:rPr>
+  </w:style>
+  <w:style w:type="paragraph" w:customStyle="1" w:styleId="ResumeRole">
+    <w:name w:val="Resume Role"/>
+    <w:rPr>
+      <w:rFonts w:ascii="Arial" w:hAnsi="Arial" w:eastAsia="Arial"/>
+      <w:b/>
+      <w:color w:val="23272D"/>
+      <w:sz w:val="20"/>
+    </w:rPr>
   </w:style>
 </w:styles>
 </file>

</xml_diff>

<commit_message>
Update Senior Backend resume and generator: synchronize Markdown source with finalized content, enhance builder functionality, and improve documentation.
</commit_message>
<xml_diff>
--- a/resumes/senior-backend/resume.docx
+++ b/resumes/senior-backend/resume.docx
@@ -142,7 +142,7 @@
         <w:rPr>
           <w:b w:val="0"/>
         </w:rPr>
-        <w:t>Backend team lead contributing to grooming, planning, implementation guidance, and code reviews within a 30-person development team</w:t>
+        <w:t>Backend team lead contributing to grooming, planning, implementation guidance, and code reviews within a 30-person development team.</w:t>
       </w:r>
     </w:p>
     <w:p>
@@ -162,7 +162,7 @@
         <w:rPr>
           <w:b w:val="0"/>
         </w:rPr>
-        <w:t>Designed and delivered Java and Spring Boot services across a microservices architecture of nearly 20 running services</w:t>
+        <w:t>Designed and delivered Java and Spring Boot services across a microservices architecture of nearly 20 running services.</w:t>
       </w:r>
     </w:p>
     <w:p>
@@ -182,7 +182,7 @@
         <w:rPr>
           <w:b w:val="0"/>
         </w:rPr>
-        <w:t>Helped deliver an internal election-management platform supporting 50,000 users alongside a public-facing application</w:t>
+        <w:t>Helped deliver an internal election-management platform supporting 50,000 users alongside a public-facing application.</w:t>
       </w:r>
     </w:p>
     <w:p>
@@ -202,7 +202,7 @@
         <w:rPr>
           <w:b w:val="0"/>
         </w:rPr>
-        <w:t>Reduced exam-management system response time by 30% through Redis caching and backend performance improvements</w:t>
+        <w:t>Reduced exam-management system response time by 30% through Redis caching and backend performance improvements.</w:t>
       </w:r>
     </w:p>
     <w:p>
@@ -222,7 +222,7 @@
         <w:rPr>
           <w:b w:val="0"/>
         </w:rPr>
-        <w:t>Supported production workflows used by 2,500+ administrators, 1,000 invigilators, and 1,000 examinees, including payments for nearly 30,000 students</w:t>
+        <w:t>Supported production workflows used by 2,500+ administrators, 1,000 invigilators, and 1,000 examinees, including payments for nearly 30,000 students.</w:t>
       </w:r>
     </w:p>
     <w:p>
@@ -242,7 +242,7 @@
         <w:rPr>
           <w:b w:val="0"/>
         </w:rPr>
-        <w:t>Contributed to the National Electronic Government Procurement System, supporting enterprise workflows, data integrity, and privacy</w:t>
+        <w:t>Contributed to the National Electronic Government Procurement System, supporting enterprise workflows, data integrity, and privacy.</w:t>
       </w:r>
     </w:p>
     <w:p>
@@ -439,7 +439,7 @@
         <w:rPr>
           <w:b w:val="0"/>
         </w:rPr>
-        <w:t>Serve as backend team lead for an Election Management System, guiding grooming, planning, implementation, and code reviews within a 30-person development team</w:t>
+        <w:t>Serve as backend team lead for an Election Management System, guiding grooming, planning, implementation, and code reviews within a 30-person development team.</w:t>
       </w:r>
     </w:p>
     <w:p>
@@ -459,7 +459,7 @@
         <w:rPr>
           <w:b w:val="0"/>
         </w:rPr>
-        <w:t>Design and implement secure, scalable Java, Spring Boot, Hibernate, and REST API services across a microservices architecture of nearly 20 running services</w:t>
+        <w:t>Design and implement secure, scalable Java, Spring Boot, Hibernate, and REST API services across a microservices architecture of nearly 20 running services.</w:t>
       </w:r>
     </w:p>
     <w:p>
@@ -479,7 +479,7 @@
         <w:rPr>
           <w:b w:val="0"/>
         </w:rPr>
-        <w:t>Help deliver an internal system supporting 50,000 users alongside a public-facing application that does not require authentication</w:t>
+        <w:t>Help deliver an internal system supporting 50,000 users, alongside a public-facing application that does not require authentication.</w:t>
       </w:r>
     </w:p>
     <w:p>
@@ -499,7 +499,7 @@
         <w:rPr>
           <w:b w:val="0"/>
         </w:rPr>
-        <w:t>Support Kubernetes deployments to the organization’s self-managed data center and digitized election-result workflows formerly dependent on paperwork and physical result delivery</w:t>
+        <w:t>Support deployments to the organization's self-managed data center using Kubernetes and digitized election-result workflows previously dependent on paperwork and physical result delivery.</w:t>
       </w:r>
     </w:p>
     <w:p>
@@ -560,7 +560,7 @@
         <w:rPr>
           <w:b w:val="0"/>
         </w:rPr>
-        <w:t>Led development of an exam management system using Java, Spring Boot, PostgreSQL, Flutter, and Crystal Reports; analyzed requirements and designed its database schema</w:t>
+        <w:t>Led development of an exam management system using Java, Spring Boot, PostgreSQL, Flutter, and Crystal Reports; analyzed requirements and designed its database schema.</w:t>
       </w:r>
     </w:p>
     <w:p>
@@ -580,7 +580,7 @@
         <w:rPr>
           <w:b w:val="0"/>
         </w:rPr>
-        <w:t>Reduced system response time by 30% through Redis caching and backend performance improvements</w:t>
+        <w:t>Reduced system response time by 30% through Redis caching and backend performance improvements.</w:t>
       </w:r>
     </w:p>
     <w:p>
@@ -600,7 +600,7 @@
         <w:rPr>
           <w:b w:val="0"/>
         </w:rPr>
-        <w:t>Built a real-time administrator dashboard that contributed to a 40% increase in system usage and user satisfaction</w:t>
+        <w:t>Built a real-time administrator dashboard that contributed to a 40% increase in system usage and user satisfaction.</w:t>
       </w:r>
     </w:p>
     <w:p>
@@ -620,7 +620,7 @@
         <w:rPr>
           <w:b w:val="0"/>
         </w:rPr>
-        <w:t>Deployed a production system used by 2,500+ administrators, 1,000 invigilators, and 1,000 examinees; supported registration and payment management for nearly 30,000 students</w:t>
+        <w:t>Deployed a production system used by 2,500+ administrators, 1,000 exam invigilators, and 1,000 examinees; supported registration and payment management for nearly 30,000 students.</w:t>
       </w:r>
     </w:p>
     <w:p>
@@ -681,7 +681,7 @@
         <w:rPr>
           <w:b w:val="0"/>
         </w:rPr>
-        <w:t>Implemented features and resolved defects for the National Electronic Government Procurement System while preserving data privacy and integrity</w:t>
+        <w:t>Implemented features and resolved defects for the National Electronic Government Procurement System while preserving data privacy and integrity.</w:t>
       </w:r>
     </w:p>
     <w:p>
@@ -701,7 +701,7 @@
         <w:rPr>
           <w:b w:val="0"/>
         </w:rPr>
-        <w:t>Contributed to large-file upload capabilities, relational data modeling, and enterprise workflow features; helped drive an 80% increase in user engagement over six months</w:t>
+        <w:t>Contributed to large-file upload capabilities, relational data modeling, and enterprise workflow features; helped drive an 80% increase in user engagement over six months.</w:t>
       </w:r>
     </w:p>
     <w:p>
@@ -762,7 +762,7 @@
         <w:rPr>
           <w:b w:val="0"/>
         </w:rPr>
-        <w:t>Implemented features and resolved defects for a large-scale education application using ASP.NET, C#, and SQL Server</w:t>
+        <w:t>Implemented features and resolved defects for a large-scale education application using ASP.NET, C#, and SQL Server.</w:t>
       </w:r>
     </w:p>
     <w:p>

</xml_diff>

<commit_message>
Update changelog and Senior Backend resume: reposition page break to optimize layout and enhance readability.
</commit_message>
<xml_diff>
--- a/resumes/senior-backend/resume.docx
+++ b/resumes/senior-backend/resume.docx
@@ -381,11 +381,6 @@
       </w:r>
     </w:p>
     <w:p>
-      <w:r>
-        <w:br w:type="page"/>
-      </w:r>
-    </w:p>
-    <w:p>
       <w:pPr>
         <w:pStyle w:val="ResumeSection"/>
         <w:spacing w:before="140" w:after="60"/>
@@ -658,6 +653,11 @@
           <w:b w:val="0"/>
         </w:rPr>
         <w:t>Deployed a production system used by 2,500+ administrators, 1,000 exam invigilators, and 1,000 examinees; supported registration and payment management for nearly 30,000 students.</w:t>
+      </w:r>
+    </w:p>
+    <w:p>
+      <w:r>
+        <w:br w:type="page"/>
       </w:r>
     </w:p>
     <w:p>

</xml_diff>

<commit_message>
refactor: update resumes for various roles; enhance content and formatting across multiple formats
</commit_message>
<xml_diff>
--- a/resumes/senior-backend/resume.docx
+++ b/resumes/senior-backend/resume.docx
@@ -41,8 +41,17 @@
           <w:color w:val="525860"/>
           <w:sz w:val="18"/>
         </w:rPr>
-        <w:t>Dhaka, Bangladesh  |  Contact via LinkedIn</w:t>
+        <w:t xml:space="preserve">Dhaka, Bangladesh  |  +8801912070224  |  </w:t>
       </w:r>
+      <w:hyperlink r:id="rId9">
+        <w:r>
+          <w:rPr>
+            <w:color w:val="1B375C"/>
+            <w:u w:val="single"/>
+          </w:rPr>
+          <w:t>sadmansobhan@gmail.com</w:t>
+        </w:r>
+      </w:hyperlink>
     </w:p>
     <w:p>
       <w:pPr>
@@ -52,7 +61,7 @@
           <w:bottom w:val="single" w:sz="8" w:space="5" w:color="1B375C"/>
         </w:pBdr>
       </w:pPr>
-      <w:hyperlink r:id="rId9">
+      <w:hyperlink r:id="rId10">
         <w:r>
           <w:rPr>
             <w:color w:val="1B375C"/>
@@ -69,7 +78,7 @@
         </w:rPr>
         <w:t xml:space="preserve">  |  </w:t>
       </w:r>
-      <w:hyperlink r:id="rId10">
+      <w:hyperlink r:id="rId11">
         <w:r>
           <w:rPr>
             <w:color w:val="1B375C"/>
@@ -86,7 +95,7 @@
         </w:rPr>
         <w:t xml:space="preserve">  |  </w:t>
       </w:r>
-      <w:hyperlink r:id="rId11">
+      <w:hyperlink r:id="rId12">
         <w:r>
           <w:rPr>
             <w:color w:val="1B375C"/>

</xml_diff>